<commit_message>
regenerate cgl + seic_do goldens: parenthesized markers at L3-L5
Output of the new spec — top three list levels stay period-suffixed
(A. / 1. / a.), bottom three are now parenthesized ((1) / (a) / (i)).
For cgl this also restructures the visible top-of-section markers,
since source 1) sequences now normalize to L0 A. rather than the old
default-to-L1 path.

Co-Authored-By: Claude Opus 4.7 (1M context) <noreply@anthropic.com>
</commit_message>
<xml_diff>
--- a/tests/golden/seic_do_original_formatted.docx
+++ b/tests/golden/seic_do_original_formatted.docx
@@ -21650,7 +21650,7 @@
     <w:lvl w:ilvl="3">
       <w:start w:val="1"/>
       <w:numFmt w:val="decimal"/>
-      <w:lvlText w:val="%4."/>
+      <w:lvlText w:val="(%4)"/>
       <w:lvlJc w:val="left"/>
       <w:pPr>
         <w:ind w:left="2880" w:hanging="360"/>
@@ -21659,7 +21659,7 @@
     <w:lvl w:ilvl="4">
       <w:start w:val="1"/>
       <w:numFmt w:val="lowerLetter"/>
-      <w:lvlText w:val="%5."/>
+      <w:lvlText w:val="(%5)"/>
       <w:lvlJc w:val="left"/>
       <w:pPr>
         <w:ind w:left="3600" w:hanging="360"/>
@@ -21668,7 +21668,7 @@
     <w:lvl w:ilvl="5">
       <w:start w:val="1"/>
       <w:numFmt w:val="lowerRoman"/>
-      <w:lvlText w:val="%6."/>
+      <w:lvlText w:val="(%6)"/>
       <w:lvlJc w:val="left"/>
       <w:pPr>
         <w:ind w:left="4320" w:hanging="360"/>

</xml_diff>